<commit_message>
fixed prds and phase 4
</commit_message>
<xml_diff>
--- a/Render_PRD.docx
+++ b/Render_PRD.docx
@@ -1941,7 +1941,7 @@
                 <w:sz w:val="19"/>
                 <w:szCs w:val="19"/>
               </w:rPr>
-              <w:t xml:space="preserve">Anonymous aggregated data: employer names, job titles, programs. No student names or MEIDs.</w:t>
+              <w:t xml:space="preserve">Anonymous aggregated data: employer name, job title, program, AI-generated job summary. No student names, MEIDs, resumes, or cover letters.</w:t>
             </w:r>
           </w:p>
         </w:tc>
@@ -2644,7 +2644,7 @@
                 <w:sz w:val="19"/>
                 <w:szCs w:val="19"/>
               </w:rPr>
-              <w:t xml:space="preserve">Employment tab: paste job description, AI skills gap analysis, AI cover letter generation, status tracker (Saved → Applied → Interview → Offer/Pass). Freelance tab: describe ideal client type, AI generates search strategies + 8–10 real prospect names, outreach guidance, pricing check. Google Sheet pipeline sends anonymous employer data to Career Services.</w:t>
+              <w:t xml:space="preserve">Employment tab: paste job description, AI skills gap analysis, AI cover letter generation, status tracker (Saved → Applied → Interview → Offer/Pass). Full job description, resume edits, and cover letter stored together per entry so students can review their application when an interview call comes in. Freelance tab: describe ideal client type, AI generates search strategies + 8–10 real prospect names, outreach guidance, pricing check. Google Sheet pipeline sends anonymous employer data + AI-generated job summary to Career Services.</w:t>
             </w:r>
           </w:p>
         </w:tc>
@@ -2831,7 +2831,7 @@
                 <w:sz w:val="19"/>
                 <w:szCs w:val="19"/>
               </w:rPr>
-              <w:t xml:space="preserve">Store and label resume drafts (1st–4th). Instructor feedback field per draft. Active resume flag. AI generates tailored version for specific saved jobs.</w:t>
+              <w:t xml:space="preserve">Base resume drafts (1st–4th) stored and labeled with instructor feedback fields. Lives inside the Job Log — each application entry holds the tailored resume edits and cover letter for that specific job. AI suggests specific edits and additions to make to the existing resume for each job (not a full rewrite). Students review the full application package when interview calls come in.</w:t>
             </w:r>
           </w:p>
         </w:tc>
@@ -2844,31 +2844,31 @@
               <w:bottom w:val="single" w:color="ddd3c8" w:sz="1"/>
               <w:right w:val="single" w:color="ddd3c8" w:sz="1"/>
             </w:tcBorders>
-            <w:shd w:fill="f2ebe4" w:val="clear"/>
-            <w:tcMar>
-              <w:top w:type="dxa" w:w="80"/>
-              <w:left w:type="dxa" w:w="140"/>
-              <w:bottom w:type="dxa" w:w="80"/>
-              <w:right w:type="dxa" w:w="140"/>
-            </w:tcMar>
-          </w:tcPr>
-          <w:p>
-            <w:pPr>
-              <w:spacing w:before="0" w:after="0"/>
-              <w:jc w:val="left"/>
-            </w:pPr>
-            <w:r>
-              <w:rPr>
-                <w:rFonts w:ascii="Arial" w:cs="Arial" w:eastAsia="Arial" w:hAnsi="Arial"/>
-                <w:b w:val="false"/>
-                <w:bCs w:val="false"/>
-                <w:i/>
-                <w:iCs/>
-                <w:color w:val="8a7e7a"/>
-                <w:sz w:val="19"/>
-                <w:szCs w:val="19"/>
-              </w:rPr>
-              <w:t xml:space="preserve">Planned</w:t>
+            <w:shd w:fill="fdf3e7" w:val="clear"/>
+            <w:tcMar>
+              <w:top w:type="dxa" w:w="80"/>
+              <w:left w:type="dxa" w:w="140"/>
+              <w:bottom w:type="dxa" w:w="80"/>
+              <w:right w:type="dxa" w:w="140"/>
+            </w:tcMar>
+          </w:tcPr>
+          <w:p>
+            <w:pPr>
+              <w:spacing w:before="0" w:after="0"/>
+              <w:jc w:val="left"/>
+            </w:pPr>
+            <w:r>
+              <w:rPr>
+                <w:rFonts w:ascii="Arial" w:cs="Arial" w:eastAsia="Arial" w:hAnsi="Arial"/>
+                <w:b/>
+                <w:bCs/>
+                <w:i w:val="false"/>
+                <w:iCs w:val="false"/>
+                <w:color w:val="b8956a"/>
+                <w:sz w:val="19"/>
+                <w:szCs w:val="19"/>
+              </w:rPr>
+              <w:t xml:space="preserve">In progress</w:t>
             </w:r>
           </w:p>
         </w:tc>
@@ -3018,7 +3018,7 @@
                 <w:sz w:val="19"/>
                 <w:szCs w:val="19"/>
               </w:rPr>
-              <w:t xml:space="preserve">Software stack checklist by program. Skills-to-build list auto-populated from job search gaps. AI recommends free resources (Coursera, YouTube, LinkedIn Learning). PD activity log. Portfolio project idea generator.</w:t>
+              <w:t xml:space="preserve">Software stack checklist by program (6 categories, ~60 tools). Skills-to-build list — add manually or pull gaps automatically from saved job entries via AI. AI recommends free resources by name (specific YouTube channels, Coursera courses, Adobe tutorials). Portfolio project idea generator tied to real job requirements. PD activity log (activity, category, time, reflection) that feeds into the final PD plan.</w:t>
             </w:r>
           </w:p>
         </w:tc>
@@ -3031,31 +3031,31 @@
               <w:bottom w:val="single" w:color="ddd3c8" w:sz="1"/>
               <w:right w:val="single" w:color="ddd3c8" w:sz="1"/>
             </w:tcBorders>
-            <w:shd w:fill="f2ebe4" w:val="clear"/>
-            <w:tcMar>
-              <w:top w:type="dxa" w:w="80"/>
-              <w:left w:type="dxa" w:w="140"/>
-              <w:bottom w:type="dxa" w:w="80"/>
-              <w:right w:type="dxa" w:w="140"/>
-            </w:tcMar>
-          </w:tcPr>
-          <w:p>
-            <w:pPr>
-              <w:spacing w:before="0" w:after="0"/>
-              <w:jc w:val="left"/>
-            </w:pPr>
-            <w:r>
-              <w:rPr>
-                <w:rFonts w:ascii="Arial" w:cs="Arial" w:eastAsia="Arial" w:hAnsi="Arial"/>
-                <w:b w:val="false"/>
-                <w:bCs w:val="false"/>
-                <w:i/>
-                <w:iCs/>
-                <w:color w:val="8a7e7a"/>
-                <w:sz w:val="19"/>
-                <w:szCs w:val="19"/>
-              </w:rPr>
-              <w:t xml:space="preserve">Planned</w:t>
+            <w:shd w:fill="e4ede5" w:val="clear"/>
+            <w:tcMar>
+              <w:top w:type="dxa" w:w="80"/>
+              <w:left w:type="dxa" w:w="140"/>
+              <w:bottom w:type="dxa" w:w="80"/>
+              <w:right w:type="dxa" w:w="140"/>
+            </w:tcMar>
+          </w:tcPr>
+          <w:p>
+            <w:pPr>
+              <w:spacing w:before="0" w:after="0"/>
+              <w:jc w:val="left"/>
+            </w:pPr>
+            <w:r>
+              <w:rPr>
+                <w:rFonts w:ascii="Arial" w:cs="Arial" w:eastAsia="Arial" w:hAnsi="Arial"/>
+                <w:b/>
+                <w:bCs/>
+                <w:i w:val="false"/>
+                <w:iCs w:val="false"/>
+                <w:color w:val="4a7c4e"/>
+                <w:sz w:val="19"/>
+                <w:szCs w:val="19"/>
+              </w:rPr>
+              <w:t xml:space="preserve">✓ Built</w:t>
             </w:r>
           </w:p>
         </w:tc>
@@ -3884,7 +3884,7 @@
                 <w:sz w:val="19"/>
                 <w:szCs w:val="19"/>
               </w:rPr>
-              <w:t xml:space="preserve">Employer name, job title, URL, interest level, program area</w:t>
+              <w:t xml:space="preserve">Employer name, job title, program, AI-generated job summary</w:t>
             </w:r>
           </w:p>
         </w:tc>
@@ -4228,7 +4228,26 @@
           <w:sz w:val="22"/>
           <w:szCs w:val="22"/>
         </w:rPr>
-        <w:t xml:space="preserve">When a student saves an employment job entry, Render sends an anonymous row to a Google Sheet via Google Apps Script. Career Services gets a live feed of which companies GCC DMA students are targeting.</w:t>
+        <w:t xml:space="preserve">When a student saves an employment job entry, Render automatically generates a 2-3 sentence AI summary of the job description and sends it to a Google Sheet along with the employer name, job title, and student program. Career Services gets actionable employer intelligence without any student identifying information.</w:t>
+      </w:r>
+    </w:p>
+    <w:p>
+      <w:pPr>
+        <w:spacing w:before="0" w:after="120"/>
+        <w:jc w:val="left"/>
+      </w:pPr>
+      <w:r>
+        <w:rPr>
+          <w:rFonts w:ascii="Arial" w:cs="Arial" w:eastAsia="Arial" w:hAnsi="Arial"/>
+          <w:b w:val="false"/>
+          <w:bCs w:val="false"/>
+          <w:i w:val="false"/>
+          <w:iCs w:val="false"/>
+          <w:color w:val="3a2e3f"/>
+          <w:sz w:val="22"/>
+          <w:szCs w:val="22"/>
+        </w:rPr>
+        <w:t xml:space="preserve">The full job description, tailored resume edits, and cover letter stay in the student's local dashboard — Career Services never sees those. If the AI summary fails for any reason, the first 300 characters of the description are sent as a fallback.</w:t>
       </w:r>
     </w:p>
     <w:p>
@@ -4304,7 +4323,7 @@
                 <w:sz w:val="19"/>
                 <w:szCs w:val="19"/>
               </w:rPr>
-              <w:t xml:space="preserve">Date  ·  Employer Name  ·  Job Title  ·  Job URL  ·  Interest Level  ·  Program Area</w:t>
+              <w:t xml:space="preserve">Date  ·  Employer Name  ·  Job Title  ·  Program  ·  AI-Generated Job Summary (2-3 sentences)</w:t>
             </w:r>
           </w:p>
           <w:p>
@@ -4323,7 +4342,7 @@
                 <w:sz w:val="19"/>
                 <w:szCs w:val="19"/>
               </w:rPr>
-              <w:t xml:space="preserve">NOT sent: student name, MEID, or any personally identifiable information.</w:t>
+              <w:t xml:space="preserve">NOT sent: student name, MEID, full job description, resume, or cover letter.</w:t>
             </w:r>
           </w:p>
         </w:tc>
@@ -4715,7 +4734,7 @@
                 <w:sz w:val="19"/>
                 <w:szCs w:val="19"/>
               </w:rPr>
-              <w:t xml:space="preserve">Job Analysis</w:t>
+              <w:t xml:space="preserve">Job Analysis ✓</w:t>
             </w:r>
           </w:p>
         </w:tc>
@@ -4828,7 +4847,7 @@
                 <w:sz w:val="19"/>
                 <w:szCs w:val="19"/>
               </w:rPr>
-              <w:t xml:space="preserve">Cover Letter</w:t>
+              <w:t xml:space="preserve">Cover Letter ✓</w:t>
             </w:r>
           </w:p>
         </w:tc>
@@ -4902,7 +4921,7 @@
                 <w:sz w:val="19"/>
                 <w:szCs w:val="19"/>
               </w:rPr>
-              <w:t xml:space="preserve">Tailored 3-paragraph cover letter, specific to role and student background, no clichés</w:t>
+              <w:t xml:space="preserve">Tailored 3-paragraph cover letter, specific to role and background, no clichés</w:t>
             </w:r>
           </w:p>
         </w:tc>
@@ -4941,7 +4960,7 @@
                 <w:sz w:val="19"/>
                 <w:szCs w:val="19"/>
               </w:rPr>
-              <w:t xml:space="preserve">Freelance Lead Gen</w:t>
+              <w:t xml:space="preserve">Freelance Lead Gen ✓</w:t>
             </w:r>
           </w:p>
         </w:tc>
@@ -5015,7 +5034,7 @@
                 <w:sz w:val="19"/>
                 <w:szCs w:val="19"/>
               </w:rPr>
-              <w:t xml:space="preserve">Search strategies, 5 specific places to find clients, 8–10 real prospect names, pricing reality check</w:t>
+              <w:t xml:space="preserve">Search strategies, 5 places to find clients, 8–10 real prospect names, pricing reality check</w:t>
             </w:r>
           </w:p>
         </w:tc>
@@ -5054,7 +5073,7 @@
                 <w:sz w:val="19"/>
                 <w:szCs w:val="19"/>
               </w:rPr>
-              <w:t xml:space="preserve">Skills &amp; PD (Phase 4)</w:t>
+              <w:t xml:space="preserve">Career Services Summary ✓</w:t>
             </w:r>
           </w:p>
         </w:tc>
@@ -5091,7 +5110,7 @@
                 <w:sz w:val="19"/>
                 <w:szCs w:val="19"/>
               </w:rPr>
-              <w:t xml:space="preserve">Student profile + skill gaps from job log</w:t>
+              <w:t xml:space="preserve">Job description (up to 1500 chars)</w:t>
             </w:r>
           </w:p>
         </w:tc>
@@ -5128,7 +5147,459 @@
                 <w:sz w:val="19"/>
                 <w:szCs w:val="19"/>
               </w:rPr>
-              <w:t xml:space="preserve">Free course recommendations, new portfolio project ideas</w:t>
+              <w:t xml:space="preserve">2-3 sentence summary sent to Career Services sheet — full description stays with student</w:t>
+            </w:r>
+          </w:p>
+        </w:tc>
+      </w:tr>
+      <w:tr>
+        <w:tc>
+          <w:tcPr>
+            <w:tcW w:type="dxa" w:w="2200"/>
+            <w:tcBorders>
+              <w:top w:val="single" w:color="ddd3c8" w:sz="1"/>
+              <w:left w:val="single" w:color="ddd3c8" w:sz="1"/>
+              <w:bottom w:val="single" w:color="ddd3c8" w:sz="1"/>
+              <w:right w:val="single" w:color="ddd3c8" w:sz="1"/>
+            </w:tcBorders>
+            <w:shd w:fill="e4ede5" w:val="clear"/>
+            <w:tcMar>
+              <w:top w:type="dxa" w:w="80"/>
+              <w:left w:type="dxa" w:w="140"/>
+              <w:bottom w:type="dxa" w:w="80"/>
+              <w:right w:type="dxa" w:w="140"/>
+            </w:tcMar>
+          </w:tcPr>
+          <w:p>
+            <w:pPr>
+              <w:spacing w:before="0" w:after="0"/>
+              <w:jc w:val="left"/>
+            </w:pPr>
+            <w:r>
+              <w:rPr>
+                <w:rFonts w:ascii="Arial" w:cs="Arial" w:eastAsia="Arial" w:hAnsi="Arial"/>
+                <w:b/>
+                <w:bCs/>
+                <w:i w:val="false"/>
+                <w:iCs w:val="false"/>
+                <w:color w:val="4a7c4e"/>
+                <w:sz w:val="19"/>
+                <w:szCs w:val="19"/>
+              </w:rPr>
+              <w:t xml:space="preserve">Pull Skills Gaps ✓</w:t>
+            </w:r>
+          </w:p>
+        </w:tc>
+        <w:tc>
+          <w:tcPr>
+            <w:tcW w:type="dxa" w:w="3480"/>
+            <w:tcBorders>
+              <w:top w:val="single" w:color="ddd3c8" w:sz="1"/>
+              <w:left w:val="single" w:color="ddd3c8" w:sz="1"/>
+              <w:bottom w:val="single" w:color="ddd3c8" w:sz="1"/>
+              <w:right w:val="single" w:color="ddd3c8" w:sz="1"/>
+            </w:tcBorders>
+            <w:shd w:fill="FFFFFF" w:val="clear"/>
+            <w:tcMar>
+              <w:top w:type="dxa" w:w="80"/>
+              <w:left w:type="dxa" w:w="140"/>
+              <w:bottom w:type="dxa" w:w="80"/>
+              <w:right w:type="dxa" w:w="140"/>
+            </w:tcMar>
+          </w:tcPr>
+          <w:p>
+            <w:pPr>
+              <w:spacing w:before="0" w:after="0"/>
+              <w:jc w:val="left"/>
+            </w:pPr>
+            <w:r>
+              <w:rPr>
+                <w:rFonts w:ascii="Arial" w:cs="Arial" w:eastAsia="Arial" w:hAnsi="Arial"/>
+                <w:b/>
+                <w:bCs/>
+                <w:i w:val="false"/>
+                <w:iCs w:val="false"/>
+                <w:color w:val="3a2e3f"/>
+                <w:sz w:val="19"/>
+                <w:szCs w:val="19"/>
+              </w:rPr>
+              <w:t xml:space="preserve">Student's saved job descriptions (up to 6)</w:t>
+            </w:r>
+          </w:p>
+        </w:tc>
+        <w:tc>
+          <w:tcPr>
+            <w:tcW w:type="dxa" w:w="3680"/>
+            <w:tcBorders>
+              <w:top w:val="single" w:color="ddd3c8" w:sz="1"/>
+              <w:left w:val="single" w:color="ddd3c8" w:sz="1"/>
+              <w:bottom w:val="single" w:color="ddd3c8" w:sz="1"/>
+              <w:right w:val="single" w:color="ddd3c8" w:sz="1"/>
+            </w:tcBorders>
+            <w:shd w:fill="FFFFFF" w:val="clear"/>
+            <w:tcMar>
+              <w:top w:type="dxa" w:w="80"/>
+              <w:left w:type="dxa" w:w="140"/>
+              <w:bottom w:type="dxa" w:w="80"/>
+              <w:right w:type="dxa" w:w="140"/>
+            </w:tcMar>
+          </w:tcPr>
+          <w:p>
+            <w:pPr>
+              <w:spacing w:before="0" w:after="0"/>
+              <w:jc w:val="left"/>
+            </w:pPr>
+            <w:r>
+              <w:rPr>
+                <w:rFonts w:ascii="Arial" w:cs="Arial" w:eastAsia="Arial" w:hAnsi="Arial"/>
+                <w:b/>
+                <w:bCs/>
+                <w:i w:val="false"/>
+                <w:iCs w:val="false"/>
+                <w:color w:val="3a2e3f"/>
+                <w:sz w:val="19"/>
+                <w:szCs w:val="19"/>
+              </w:rPr>
+              <w:t xml:space="preserve">6-10 specific tools/skills appearing in jobs but missing from student's stack</w:t>
+            </w:r>
+          </w:p>
+        </w:tc>
+      </w:tr>
+      <w:tr>
+        <w:tc>
+          <w:tcPr>
+            <w:tcW w:type="dxa" w:w="2200"/>
+            <w:tcBorders>
+              <w:top w:val="single" w:color="ddd3c8" w:sz="1"/>
+              <w:left w:val="single" w:color="ddd3c8" w:sz="1"/>
+              <w:bottom w:val="single" w:color="ddd3c8" w:sz="1"/>
+              <w:right w:val="single" w:color="ddd3c8" w:sz="1"/>
+            </w:tcBorders>
+            <w:shd w:fill="e4ede5" w:val="clear"/>
+            <w:tcMar>
+              <w:top w:type="dxa" w:w="80"/>
+              <w:left w:type="dxa" w:w="140"/>
+              <w:bottom w:type="dxa" w:w="80"/>
+              <w:right w:type="dxa" w:w="140"/>
+            </w:tcMar>
+          </w:tcPr>
+          <w:p>
+            <w:pPr>
+              <w:spacing w:before="0" w:after="0"/>
+              <w:jc w:val="left"/>
+            </w:pPr>
+            <w:r>
+              <w:rPr>
+                <w:rFonts w:ascii="Arial" w:cs="Arial" w:eastAsia="Arial" w:hAnsi="Arial"/>
+                <w:b/>
+                <w:bCs/>
+                <w:i w:val="false"/>
+                <w:iCs w:val="false"/>
+                <w:color w:val="4a7c4e"/>
+                <w:sz w:val="19"/>
+                <w:szCs w:val="19"/>
+              </w:rPr>
+              <w:t xml:space="preserve">Learning Recommendations ✓</w:t>
+            </w:r>
+          </w:p>
+        </w:tc>
+        <w:tc>
+          <w:tcPr>
+            <w:tcW w:type="dxa" w:w="3480"/>
+            <w:tcBorders>
+              <w:top w:val="single" w:color="ddd3c8" w:sz="1"/>
+              <w:left w:val="single" w:color="ddd3c8" w:sz="1"/>
+              <w:bottom w:val="single" w:color="ddd3c8" w:sz="1"/>
+              <w:right w:val="single" w:color="ddd3c8" w:sz="1"/>
+            </w:tcBorders>
+            <w:shd w:fill="f2ebe4" w:val="clear"/>
+            <w:tcMar>
+              <w:top w:type="dxa" w:w="80"/>
+              <w:left w:type="dxa" w:w="140"/>
+              <w:bottom w:type="dxa" w:w="80"/>
+              <w:right w:type="dxa" w:w="140"/>
+            </w:tcMar>
+          </w:tcPr>
+          <w:p>
+            <w:pPr>
+              <w:spacing w:before="0" w:after="0"/>
+              <w:jc w:val="left"/>
+            </w:pPr>
+            <w:r>
+              <w:rPr>
+                <w:rFonts w:ascii="Arial" w:cs="Arial" w:eastAsia="Arial" w:hAnsi="Arial"/>
+                <w:b/>
+                <w:bCs/>
+                <w:i w:val="false"/>
+                <w:iCs w:val="false"/>
+                <w:color w:val="3a2e3f"/>
+                <w:sz w:val="19"/>
+                <w:szCs w:val="19"/>
+              </w:rPr>
+              <w:t xml:space="preserve">Student profile + skills gap list</w:t>
+            </w:r>
+          </w:p>
+        </w:tc>
+        <w:tc>
+          <w:tcPr>
+            <w:tcW w:type="dxa" w:w="3680"/>
+            <w:tcBorders>
+              <w:top w:val="single" w:color="ddd3c8" w:sz="1"/>
+              <w:left w:val="single" w:color="ddd3c8" w:sz="1"/>
+              <w:bottom w:val="single" w:color="ddd3c8" w:sz="1"/>
+              <w:right w:val="single" w:color="ddd3c8" w:sz="1"/>
+            </w:tcBorders>
+            <w:shd w:fill="f2ebe4" w:val="clear"/>
+            <w:tcMar>
+              <w:top w:type="dxa" w:w="80"/>
+              <w:left w:type="dxa" w:w="140"/>
+              <w:bottom w:type="dxa" w:w="80"/>
+              <w:right w:type="dxa" w:w="140"/>
+            </w:tcMar>
+          </w:tcPr>
+          <w:p>
+            <w:pPr>
+              <w:spacing w:before="0" w:after="0"/>
+              <w:jc w:val="left"/>
+            </w:pPr>
+            <w:r>
+              <w:rPr>
+                <w:rFonts w:ascii="Arial" w:cs="Arial" w:eastAsia="Arial" w:hAnsi="Arial"/>
+                <w:b/>
+                <w:bCs/>
+                <w:i w:val="false"/>
+                <w:iCs w:val="false"/>
+                <w:color w:val="3a2e3f"/>
+                <w:sz w:val="19"/>
+                <w:szCs w:val="19"/>
+              </w:rPr>
+              <w:t xml:space="preserve">Named free resources — specific YouTube channels, Coursera courses, Adobe tutorials</w:t>
+            </w:r>
+          </w:p>
+        </w:tc>
+      </w:tr>
+      <w:tr>
+        <w:tc>
+          <w:tcPr>
+            <w:tcW w:type="dxa" w:w="2200"/>
+            <w:tcBorders>
+              <w:top w:val="single" w:color="ddd3c8" w:sz="1"/>
+              <w:left w:val="single" w:color="ddd3c8" w:sz="1"/>
+              <w:bottom w:val="single" w:color="ddd3c8" w:sz="1"/>
+              <w:right w:val="single" w:color="ddd3c8" w:sz="1"/>
+            </w:tcBorders>
+            <w:shd w:fill="e4ede5" w:val="clear"/>
+            <w:tcMar>
+              <w:top w:type="dxa" w:w="80"/>
+              <w:left w:type="dxa" w:w="140"/>
+              <w:bottom w:type="dxa" w:w="80"/>
+              <w:right w:type="dxa" w:w="140"/>
+            </w:tcMar>
+          </w:tcPr>
+          <w:p>
+            <w:pPr>
+              <w:spacing w:before="0" w:after="0"/>
+              <w:jc w:val="left"/>
+            </w:pPr>
+            <w:r>
+              <w:rPr>
+                <w:rFonts w:ascii="Arial" w:cs="Arial" w:eastAsia="Arial" w:hAnsi="Arial"/>
+                <w:b/>
+                <w:bCs/>
+                <w:i w:val="false"/>
+                <w:iCs w:val="false"/>
+                <w:color w:val="4a7c4e"/>
+                <w:sz w:val="19"/>
+                <w:szCs w:val="19"/>
+              </w:rPr>
+              <w:t xml:space="preserve">Portfolio Project Ideas ✓</w:t>
+            </w:r>
+          </w:p>
+        </w:tc>
+        <w:tc>
+          <w:tcPr>
+            <w:tcW w:type="dxa" w:w="3480"/>
+            <w:tcBorders>
+              <w:top w:val="single" w:color="ddd3c8" w:sz="1"/>
+              <w:left w:val="single" w:color="ddd3c8" w:sz="1"/>
+              <w:bottom w:val="single" w:color="ddd3c8" w:sz="1"/>
+              <w:right w:val="single" w:color="ddd3c8" w:sz="1"/>
+            </w:tcBorders>
+            <w:shd w:fill="FFFFFF" w:val="clear"/>
+            <w:tcMar>
+              <w:top w:type="dxa" w:w="80"/>
+              <w:left w:type="dxa" w:w="140"/>
+              <w:bottom w:type="dxa" w:w="80"/>
+              <w:right w:type="dxa" w:w="140"/>
+            </w:tcMar>
+          </w:tcPr>
+          <w:p>
+            <w:pPr>
+              <w:spacing w:before="0" w:after="0"/>
+              <w:jc w:val="left"/>
+            </w:pPr>
+            <w:r>
+              <w:rPr>
+                <w:rFonts w:ascii="Arial" w:cs="Arial" w:eastAsia="Arial" w:hAnsi="Arial"/>
+                <w:b/>
+                <w:bCs/>
+                <w:i w:val="false"/>
+                <w:iCs w:val="false"/>
+                <w:color w:val="3a2e3f"/>
+                <w:sz w:val="19"/>
+                <w:szCs w:val="19"/>
+              </w:rPr>
+              <w:t xml:space="preserve">Student profile + target job titles + skill gaps</w:t>
+            </w:r>
+          </w:p>
+        </w:tc>
+        <w:tc>
+          <w:tcPr>
+            <w:tcW w:type="dxa" w:w="3680"/>
+            <w:tcBorders>
+              <w:top w:val="single" w:color="ddd3c8" w:sz="1"/>
+              <w:left w:val="single" w:color="ddd3c8" w:sz="1"/>
+              <w:bottom w:val="single" w:color="ddd3c8" w:sz="1"/>
+              <w:right w:val="single" w:color="ddd3c8" w:sz="1"/>
+            </w:tcBorders>
+            <w:shd w:fill="FFFFFF" w:val="clear"/>
+            <w:tcMar>
+              <w:top w:type="dxa" w:w="80"/>
+              <w:left w:type="dxa" w:w="140"/>
+              <w:bottom w:type="dxa" w:w="80"/>
+              <w:right w:type="dxa" w:w="140"/>
+            </w:tcMar>
+          </w:tcPr>
+          <w:p>
+            <w:pPr>
+              <w:spacing w:before="0" w:after="0"/>
+              <w:jc w:val="left"/>
+            </w:pPr>
+            <w:r>
+              <w:rPr>
+                <w:rFonts w:ascii="Arial" w:cs="Arial" w:eastAsia="Arial" w:hAnsi="Arial"/>
+                <w:b/>
+                <w:bCs/>
+                <w:i w:val="false"/>
+                <w:iCs w:val="false"/>
+                <w:color w:val="3a2e3f"/>
+                <w:sz w:val="19"/>
+                <w:szCs w:val="19"/>
+              </w:rPr>
+              <w:t xml:space="preserve">5 realistic project ideas with title, description, time estimate, skill demonstrated</w:t>
+            </w:r>
+          </w:p>
+        </w:tc>
+      </w:tr>
+      <w:tr>
+        <w:tc>
+          <w:tcPr>
+            <w:tcW w:type="dxa" w:w="2200"/>
+            <w:tcBorders>
+              <w:top w:val="single" w:color="ddd3c8" w:sz="1"/>
+              <w:left w:val="single" w:color="ddd3c8" w:sz="1"/>
+              <w:bottom w:val="single" w:color="ddd3c8" w:sz="1"/>
+              <w:right w:val="single" w:color="ddd3c8" w:sz="1"/>
+            </w:tcBorders>
+            <w:shd w:fill="e4ede5" w:val="clear"/>
+            <w:tcMar>
+              <w:top w:type="dxa" w:w="80"/>
+              <w:left w:type="dxa" w:w="140"/>
+              <w:bottom w:type="dxa" w:w="80"/>
+              <w:right w:type="dxa" w:w="140"/>
+            </w:tcMar>
+          </w:tcPr>
+          <w:p>
+            <w:pPr>
+              <w:spacing w:before="0" w:after="0"/>
+              <w:jc w:val="left"/>
+            </w:pPr>
+            <w:r>
+              <w:rPr>
+                <w:rFonts w:ascii="Arial" w:cs="Arial" w:eastAsia="Arial" w:hAnsi="Arial"/>
+                <w:b/>
+                <w:bCs/>
+                <w:i w:val="false"/>
+                <w:iCs w:val="false"/>
+                <w:color w:val="4a7c4e"/>
+                <w:sz w:val="19"/>
+                <w:szCs w:val="19"/>
+              </w:rPr>
+              <w:t xml:space="preserve">Resume Edit Suggestions (Phase 3)</w:t>
+            </w:r>
+          </w:p>
+        </w:tc>
+        <w:tc>
+          <w:tcPr>
+            <w:tcW w:type="dxa" w:w="3480"/>
+            <w:tcBorders>
+              <w:top w:val="single" w:color="ddd3c8" w:sz="1"/>
+              <w:left w:val="single" w:color="ddd3c8" w:sz="1"/>
+              <w:bottom w:val="single" w:color="ddd3c8" w:sz="1"/>
+              <w:right w:val="single" w:color="ddd3c8" w:sz="1"/>
+            </w:tcBorders>
+            <w:shd w:fill="f2ebe4" w:val="clear"/>
+            <w:tcMar>
+              <w:top w:type="dxa" w:w="80"/>
+              <w:left w:type="dxa" w:w="140"/>
+              <w:bottom w:type="dxa" w:w="80"/>
+              <w:right w:type="dxa" w:w="140"/>
+            </w:tcMar>
+          </w:tcPr>
+          <w:p>
+            <w:pPr>
+              <w:spacing w:before="0" w:after="0"/>
+              <w:jc w:val="left"/>
+            </w:pPr>
+            <w:r>
+              <w:rPr>
+                <w:rFonts w:ascii="Arial" w:cs="Arial" w:eastAsia="Arial" w:hAnsi="Arial"/>
+                <w:b/>
+                <w:bCs/>
+                <w:i w:val="false"/>
+                <w:iCs w:val="false"/>
+                <w:color w:val="3a2e3f"/>
+                <w:sz w:val="19"/>
+                <w:szCs w:val="19"/>
+              </w:rPr>
+              <w:t xml:space="preserve">Student's base resume + job description</w:t>
+            </w:r>
+          </w:p>
+        </w:tc>
+        <w:tc>
+          <w:tcPr>
+            <w:tcW w:type="dxa" w:w="3680"/>
+            <w:tcBorders>
+              <w:top w:val="single" w:color="ddd3c8" w:sz="1"/>
+              <w:left w:val="single" w:color="ddd3c8" w:sz="1"/>
+              <w:bottom w:val="single" w:color="ddd3c8" w:sz="1"/>
+              <w:right w:val="single" w:color="ddd3c8" w:sz="1"/>
+            </w:tcBorders>
+            <w:shd w:fill="f2ebe4" w:val="clear"/>
+            <w:tcMar>
+              <w:top w:type="dxa" w:w="80"/>
+              <w:left w:type="dxa" w:w="140"/>
+              <w:bottom w:type="dxa" w:w="80"/>
+              <w:right w:type="dxa" w:w="140"/>
+            </w:tcMar>
+          </w:tcPr>
+          <w:p>
+            <w:pPr>
+              <w:spacing w:before="0" w:after="0"/>
+              <w:jc w:val="left"/>
+            </w:pPr>
+            <w:r>
+              <w:rPr>
+                <w:rFonts w:ascii="Arial" w:cs="Arial" w:eastAsia="Arial" w:hAnsi="Arial"/>
+                <w:b/>
+                <w:bCs/>
+                <w:i w:val="false"/>
+                <w:iCs w:val="false"/>
+                <w:color w:val="3a2e3f"/>
+                <w:sz w:val="19"/>
+                <w:szCs w:val="19"/>
+              </w:rPr>
+              <w:t xml:space="preserve">Specific edits and additions to tailor the resume — not a full rewrite</w:t>
             </w:r>
           </w:p>
         </w:tc>
@@ -7324,7 +7795,7 @@
                 <w:sz w:val="19"/>
                 <w:szCs w:val="19"/>
               </w:rPr>
-              <w:t xml:space="preserve">Profile, Goals, Links Hub, Job/Client Log with AI analysis and Career Services pipeline. Deployed and ready to test.</w:t>
+              <w:t xml:space="preserve">Profile, Goals, Links Hub, Job/Client Log with AI analysis, cover letter generation, freelance lead gen, and Career Services pipeline.</w:t>
             </w:r>
           </w:p>
         </w:tc>
@@ -7363,7 +7834,7 @@
                 <w:sz w:val="19"/>
                 <w:szCs w:val="19"/>
               </w:rPr>
-              <w:t xml:space="preserve">Phase 3 — Resume Vault</w:t>
+              <w:t xml:space="preserve">Phase 4 — Skills &amp; PD complete</w:t>
             </w:r>
           </w:p>
         </w:tc>
@@ -7376,6 +7847,43 @@
               <w:bottom w:val="single" w:color="ddd3c8" w:sz="1"/>
               <w:right w:val="single" w:color="ddd3c8" w:sz="1"/>
             </w:tcBorders>
+            <w:shd w:fill="e4ede5" w:val="clear"/>
+            <w:tcMar>
+              <w:top w:type="dxa" w:w="80"/>
+              <w:left w:type="dxa" w:w="140"/>
+              <w:bottom w:type="dxa" w:w="80"/>
+              <w:right w:type="dxa" w:w="140"/>
+            </w:tcMar>
+          </w:tcPr>
+          <w:p>
+            <w:pPr>
+              <w:spacing w:before="0" w:after="0"/>
+              <w:jc w:val="left"/>
+            </w:pPr>
+            <w:r>
+              <w:rPr>
+                <w:rFonts w:ascii="Arial" w:cs="Arial" w:eastAsia="Arial" w:hAnsi="Arial"/>
+                <w:b/>
+                <w:bCs/>
+                <w:i w:val="false"/>
+                <w:iCs w:val="false"/>
+                <w:color w:val="4a7c4e"/>
+                <w:sz w:val="19"/>
+                <w:szCs w:val="19"/>
+              </w:rPr>
+              <w:t xml:space="preserve">March 2026 ✓</w:t>
+            </w:r>
+          </w:p>
+        </w:tc>
+        <w:tc>
+          <w:tcPr>
+            <w:tcW w:type="dxa" w:w="5360"/>
+            <w:tcBorders>
+              <w:top w:val="single" w:color="ddd3c8" w:sz="1"/>
+              <w:left w:val="single" w:color="ddd3c8" w:sz="1"/>
+              <w:bottom w:val="single" w:color="ddd3c8" w:sz="1"/>
+              <w:right w:val="single" w:color="ddd3c8" w:sz="1"/>
+            </w:tcBorders>
             <w:shd w:fill="f2ebe4" w:val="clear"/>
             <w:tcMar>
               <w:top w:type="dxa" w:w="80"/>
@@ -7400,44 +7908,7 @@
                 <w:sz w:val="19"/>
                 <w:szCs w:val="19"/>
               </w:rPr>
-              <w:t xml:space="preserve">April 2026</w:t>
-            </w:r>
-          </w:p>
-        </w:tc>
-        <w:tc>
-          <w:tcPr>
-            <w:tcW w:type="dxa" w:w="5360"/>
-            <w:tcBorders>
-              <w:top w:val="single" w:color="ddd3c8" w:sz="1"/>
-              <w:left w:val="single" w:color="ddd3c8" w:sz="1"/>
-              <w:bottom w:val="single" w:color="ddd3c8" w:sz="1"/>
-              <w:right w:val="single" w:color="ddd3c8" w:sz="1"/>
-            </w:tcBorders>
-            <w:shd w:fill="f2ebe4" w:val="clear"/>
-            <w:tcMar>
-              <w:top w:type="dxa" w:w="80"/>
-              <w:left w:type="dxa" w:w="140"/>
-              <w:bottom w:type="dxa" w:w="80"/>
-              <w:right w:type="dxa" w:w="140"/>
-            </w:tcMar>
-          </w:tcPr>
-          <w:p>
-            <w:pPr>
-              <w:spacing w:before="0" w:after="0"/>
-              <w:jc w:val="left"/>
-            </w:pPr>
-            <w:r>
-              <w:rPr>
-                <w:rFonts w:ascii="Arial" w:cs="Arial" w:eastAsia="Arial" w:hAnsi="Arial"/>
-                <w:b/>
-                <w:bCs/>
-                <w:i w:val="false"/>
-                <w:iCs w:val="false"/>
-                <w:color w:val="3a2e3f"/>
-                <w:sz w:val="19"/>
-                <w:szCs w:val="19"/>
-              </w:rPr>
-              <w:t xml:space="preserve">Resume draft storage, feedback fields, active resume flag, tailored resume generation per saved job.</w:t>
+              <w:t xml:space="preserve">Software stack map, AI gap analysis from job log, named learning recommendations, portfolio project ideas, PD activity log.</w:t>
             </w:r>
           </w:p>
         </w:tc>
@@ -7476,7 +7947,7 @@
                 <w:sz w:val="19"/>
                 <w:szCs w:val="19"/>
               </w:rPr>
-              <w:t xml:space="preserve">Phase 4 — Skills &amp; PD</w:t>
+              <w:t xml:space="preserve">Phase 3 — Resume Vault</w:t>
             </w:r>
           </w:p>
         </w:tc>
@@ -7513,7 +7984,7 @@
                 <w:sz w:val="19"/>
                 <w:szCs w:val="19"/>
               </w:rPr>
-              <w:t xml:space="preserve">April 2026</w:t>
+              <w:t xml:space="preserve">In progress</w:t>
             </w:r>
           </w:p>
         </w:tc>
@@ -7550,7 +8021,7 @@
                 <w:sz w:val="19"/>
                 <w:szCs w:val="19"/>
               </w:rPr>
-              <w:t xml:space="preserve">Software stack map, gap analysis from job log, AI resource recommendations, portfolio project idea generator.</w:t>
+              <w:t xml:space="preserve">Base resume draft storage. Tailored resume edit suggestions per job — lives inside each job entry alongside the cover letter.</w:t>
             </w:r>
           </w:p>
         </w:tc>
@@ -7626,7 +8097,7 @@
                 <w:sz w:val="19"/>
                 <w:szCs w:val="19"/>
               </w:rPr>
-              <w:t xml:space="preserve">May 2026</w:t>
+              <w:t xml:space="preserve">April 2026</w:t>
             </w:r>
           </w:p>
         </w:tc>

</xml_diff>